<commit_message>
Created P4 SLA timings report. Archived old files
</commit_message>
<xml_diff>
--- a/Symphony/outputs/reports/Cases_Management_Report_Completed.docx
+++ b/Symphony/outputs/reports/Cases_Management_Report_Completed.docx
@@ -126,7 +126,7 @@
               </w:rPr>
             </w:r>
             <w:r>
-              <w:t>{Total Cases}</w:t>
+              <w:t>257</w:t>
             </w:r>
           </w:p>
         </w:tc>
@@ -186,7 +186,7 @@
               </w:rPr>
             </w:r>
             <w:r>
-              <w:t>{Open/UnResolved}</w:t>
+              <w:t>25</w:t>
             </w:r>
           </w:p>
         </w:tc>
@@ -227,7 +227,7 @@
               </w:rPr>
             </w:r>
             <w:r>
-              <w:t>{TTR}</w:t>
+              <w:t>3 days, 17 hrs, 44 mins</w:t>
             </w:r>
           </w:p>
         </w:tc>
@@ -254,7 +254,7 @@
               </w:rPr>
             </w:r>
             <w:r>
-              <w:t>{Top Trend}</w:t>
+              <w:t>Integration &amp; Interfaces / Third-Party Systems</w:t>
             </w:r>
           </w:p>
         </w:tc>
@@ -1105,22 +1105,86 @@
                 <w:noProof/>
               </w:rPr>
             </w:r>
-            <w:r>
-              <w:t>{CASES CREATED BY MONTH CHART}</w:t>
-            </w:r>
-          </w:p>
-        </w:tc>
-        <w:tc>
-          <w:tcPr>
-            <w:tcW w:w="5112" w:type="dxa"/>
-          </w:tcPr>
-          <w:p>
-            <w:pPr>
-              <w:jc w:val="center"/>
-            </w:pPr>
             <w:r/>
             <w:r>
-              <w:t>{Top Products by Case Volume Chart}</w:t>
+              <w:drawing>
+                <wp:inline xmlns:a="http://schemas.openxmlformats.org/drawingml/2006/main" xmlns:pic="http://schemas.openxmlformats.org/drawingml/2006/picture">
+                  <wp:extent cx="5486400" cy="2194560"/>
+                  <wp:docPr id="1" name="Picture 1"/>
+                  <wp:cNvGraphicFramePr>
+                    <a:graphicFrameLocks noChangeAspect="1"/>
+                  </wp:cNvGraphicFramePr>
+                  <a:graphic>
+                    <a:graphicData uri="http://schemas.openxmlformats.org/drawingml/2006/picture">
+                      <pic:pic>
+                        <pic:nvPicPr>
+                          <pic:cNvPr id="0" name="monthly_case_trend.png"/>
+                          <pic:cNvPicPr/>
+                        </pic:nvPicPr>
+                        <pic:blipFill>
+                          <a:blip r:embed="rId13"/>
+                          <a:stretch>
+                            <a:fillRect/>
+                          </a:stretch>
+                        </pic:blipFill>
+                        <pic:spPr>
+                          <a:xfrm>
+                            <a:off x="0" y="0"/>
+                            <a:ext cx="5486400" cy="2194560"/>
+                          </a:xfrm>
+                          <a:prstGeom prst="rect"/>
+                        </pic:spPr>
+                      </pic:pic>
+                    </a:graphicData>
+                  </a:graphic>
+                </wp:inline>
+              </w:drawing>
+            </w:r>
+          </w:p>
+        </w:tc>
+        <w:tc>
+          <w:tcPr>
+            <w:tcW w:w="5112" w:type="dxa"/>
+          </w:tcPr>
+          <w:p>
+            <w:pPr>
+              <w:jc w:val="center"/>
+            </w:pPr>
+            <w:r/>
+            <w:r/>
+            <w:r>
+              <w:drawing>
+                <wp:inline xmlns:a="http://schemas.openxmlformats.org/drawingml/2006/main" xmlns:pic="http://schemas.openxmlformats.org/drawingml/2006/picture">
+                  <wp:extent cx="5486400" cy="2743200"/>
+                  <wp:docPr id="2" name="Picture 2"/>
+                  <wp:cNvGraphicFramePr>
+                    <a:graphicFrameLocks noChangeAspect="1"/>
+                  </wp:cNvGraphicFramePr>
+                  <a:graphic>
+                    <a:graphicData uri="http://schemas.openxmlformats.org/drawingml/2006/picture">
+                      <pic:pic>
+                        <pic:nvPicPr>
+                          <pic:cNvPr id="0" name="product_distribution.png"/>
+                          <pic:cNvPicPr/>
+                        </pic:nvPicPr>
+                        <pic:blipFill>
+                          <a:blip r:embed="rId14"/>
+                          <a:stretch>
+                            <a:fillRect/>
+                          </a:stretch>
+                        </pic:blipFill>
+                        <pic:spPr>
+                          <a:xfrm>
+                            <a:off x="0" y="0"/>
+                            <a:ext cx="5486400" cy="2743200"/>
+                          </a:xfrm>
+                          <a:prstGeom prst="rect"/>
+                        </pic:spPr>
+                      </pic:pic>
+                    </a:graphicData>
+                  </a:graphic>
+                </wp:inline>
+              </w:drawing>
             </w:r>
           </w:p>
         </w:tc>
@@ -2281,8 +2345,40 @@
                 <w:noProof/>
               </w:rPr>
             </w:r>
+            <w:r/>
             <w:r>
-              <w:t>{Priority Profile Chart}</w:t>
+              <w:drawing>
+                <wp:inline xmlns:a="http://schemas.openxmlformats.org/drawingml/2006/main" xmlns:pic="http://schemas.openxmlformats.org/drawingml/2006/picture">
+                  <wp:extent cx="5486400" cy="3657600"/>
+                  <wp:docPr id="3" name="Picture 3"/>
+                  <wp:cNvGraphicFramePr>
+                    <a:graphicFrameLocks noChangeAspect="1"/>
+                  </wp:cNvGraphicFramePr>
+                  <a:graphic>
+                    <a:graphicData uri="http://schemas.openxmlformats.org/drawingml/2006/picture">
+                      <pic:pic>
+                        <pic:nvPicPr>
+                          <pic:cNvPr id="0" name="priority_profile.png"/>
+                          <pic:cNvPicPr/>
+                        </pic:nvPicPr>
+                        <pic:blipFill>
+                          <a:blip r:embed="rId15"/>
+                          <a:stretch>
+                            <a:fillRect/>
+                          </a:stretch>
+                        </pic:blipFill>
+                        <pic:spPr>
+                          <a:xfrm>
+                            <a:off x="0" y="0"/>
+                            <a:ext cx="5486400" cy="3657600"/>
+                          </a:xfrm>
+                          <a:prstGeom prst="rect"/>
+                        </pic:spPr>
+                      </pic:pic>
+                    </a:graphicData>
+                  </a:graphic>
+                </wp:inline>
+              </w:drawing>
             </w:r>
           </w:p>
         </w:tc>

</xml_diff>

<commit_message>
added P3 report and P4 csv
</commit_message>
<xml_diff>
--- a/Symphony/outputs/reports/Cases_Management_Report_Completed.docx
+++ b/Symphony/outputs/reports/Cases_Management_Report_Completed.docx
@@ -126,7 +126,7 @@
               </w:rPr>
             </w:r>
             <w:r>
-              <w:t>257</w:t>
+              <w:t>210</w:t>
             </w:r>
           </w:p>
         </w:tc>
@@ -186,7 +186,7 @@
               </w:rPr>
             </w:r>
             <w:r>
-              <w:t>25</w:t>
+              <w:t>24</w:t>
             </w:r>
           </w:p>
         </w:tc>
@@ -227,7 +227,7 @@
               </w:rPr>
             </w:r>
             <w:r>
-              <w:t>3 days, 17 hrs, 44 mins</w:t>
+              <w:t>1 days, 20 hrs, 57 mins</w:t>
             </w:r>
           </w:p>
         </w:tc>

</xml_diff>